<commit_message>
did some clean up
</commit_message>
<xml_diff>
--- a/FounderCheck_Project_Report.docx
+++ b/FounderCheck_Project_Report.docx
@@ -65,14 +65,7 @@
           <w:sz w:val="21"/>
           <w:szCs w:val="21"/>
         </w:rPr>
-        <w:t xml:space="preserve">Bangladesh's startup ecosystem includes real infrastructure, incubators, accelerators, and government grants, but access to mentorship and structured idea validation remains concentrated in Dhaka and Chittagong. The Bangladesh Hi Tech Park Authority's own </w:t>
-      </w:r>
-      <w:r>
-        <w:rPr>
-          <w:sz w:val="21"/>
-          <w:szCs w:val="21"/>
-        </w:rPr>
-        <w:t xml:space="preserve">assessment of the ecosystem states that entrepreneurial support outside these two cities remains underdeveloped, and that </w:t>
+        <w:t xml:space="preserve">Bangladesh's startup ecosystem includes real infrastructure, incubators, accelerators, and government grants, but access to mentorship and structured idea validation remains concentrated in Dhaka and Chittagong. The Bangladesh Hi Tech Park Authority's own assessment of the ecosystem states that entrepreneurial support outside these two cities remains underdeveloped, and that </w:t>
       </w:r>
       <w:r>
         <w:rPr>
@@ -100,14 +93,7 @@
           <w:sz w:val="21"/>
           <w:szCs w:val="21"/>
         </w:rPr>
-        <w:t xml:space="preserve"> entrepreneurs to compete in. A founder outside this network, or one</w:t>
-      </w:r>
-      <w:r>
-        <w:rPr>
-          <w:sz w:val="21"/>
-          <w:szCs w:val="21"/>
-        </w:rPr>
-        <w:t xml:space="preserve"> unable to pay for a foreign, United States </w:t>
+        <w:t xml:space="preserve"> entrepreneurs to compete in. A founder outside this network, or one unable to pay for a foreign, United States </w:t>
       </w:r>
       <w:r>
         <w:rPr>
@@ -161,14 +147,7 @@
           <w:sz w:val="21"/>
           <w:szCs w:val="21"/>
         </w:rPr>
-        <w:t xml:space="preserve"> AI lets a founder describe a startup idea in plain language</w:t>
-      </w:r>
-      <w:r>
-        <w:rPr>
-          <w:sz w:val="21"/>
-          <w:szCs w:val="21"/>
-        </w:rPr>
-        <w:t xml:space="preserve"> and receive a structured, </w:t>
+        <w:t xml:space="preserve"> AI lets a founder describe a startup idea in plain language and receive a structured, </w:t>
       </w:r>
       <w:r>
         <w:rPr>
@@ -182,14 +161,7 @@
           <w:sz w:val="21"/>
           <w:szCs w:val="21"/>
         </w:rPr>
-        <w:t xml:space="preserve"> readiness assessment. Analysis covers demand validation, regulatory risk, and business model scoring, combined into a single readiness score that is always explained by the factors behind it, never shown as an unexpl</w:t>
-      </w:r>
-      <w:r>
-        <w:rPr>
-          <w:sz w:val="21"/>
-          <w:szCs w:val="21"/>
-        </w:rPr>
-        <w:t xml:space="preserve">ained number. Extended analysis generates financial projections, a SWOT analysis, a </w:t>
+        <w:t xml:space="preserve"> readiness assessment. Analysis covers demand validation, regulatory risk, and business model scoring, combined into a single readiness score that is always explained by the factors behind it, never shown as an unexplained number. Extended analysis generates financial projections, a SWOT analysis, a </w:t>
       </w:r>
       <w:r>
         <w:rPr>
@@ -262,14 +234,7 @@
           <w:sz w:val="21"/>
           <w:szCs w:val="21"/>
         </w:rPr>
-        <w:t>Ba</w:t>
-      </w:r>
-      <w:r>
-        <w:rPr>
-          <w:sz w:val="21"/>
-          <w:szCs w:val="21"/>
-        </w:rPr>
-        <w:t xml:space="preserve">ckend: </w:t>
+        <w:t xml:space="preserve">Backend: </w:t>
       </w:r>
       <w:proofErr w:type="spellStart"/>
       <w:r>
@@ -329,14 +294,7 @@
           <w:sz w:val="21"/>
           <w:szCs w:val="21"/>
         </w:rPr>
-        <w:t>, built wit</w:t>
-      </w:r>
-      <w:r>
-        <w:rPr>
-          <w:sz w:val="21"/>
-          <w:szCs w:val="21"/>
-        </w:rPr>
-        <w:t xml:space="preserve">h </w:t>
+        <w:t xml:space="preserve">, built with </w:t>
       </w:r>
       <w:proofErr w:type="spellStart"/>
       <w:r>
@@ -436,14 +394,7 @@
           <w:sz w:val="21"/>
           <w:szCs w:val="21"/>
         </w:rPr>
-        <w:t xml:space="preserve"> GPT-3.5-turbo, called through a serv</w:t>
-      </w:r>
-      <w:r>
-        <w:rPr>
-          <w:sz w:val="21"/>
-          <w:szCs w:val="21"/>
-        </w:rPr>
-        <w:t>ice layer that never lets a failed call return a fabricated score. A failed call surfaces an honest</w:t>
+        <w:t xml:space="preserve"> GPT-3.5-turbo, called through a service layer that never lets a failed call return a fabricated score. A failed call surfaces an honest</w:t>
       </w:r>
       <w:r>
         <w:rPr>
@@ -501,12 +452,6 @@
         <w:gridCol w:w="5160"/>
       </w:tblGrid>
       <w:tr>
-        <w:tblPrEx>
-          <w:tblCellMar>
-            <w:top w:w="0" w:type="dxa"/>
-            <w:bottom w:w="0" w:type="dxa"/>
-          </w:tblCellMar>
-        </w:tblPrEx>
         <w:tc>
           <w:tcPr>
             <w:tcW w:w="4200" w:type="dxa"/>
@@ -549,12 +494,6 @@
         </w:tc>
       </w:tr>
       <w:tr>
-        <w:tblPrEx>
-          <w:tblCellMar>
-            <w:top w:w="0" w:type="dxa"/>
-            <w:bottom w:w="0" w:type="dxa"/>
-          </w:tblCellMar>
-        </w:tblPrEx>
         <w:tc>
           <w:tcPr>
             <w:tcW w:w="4200" w:type="dxa"/>
@@ -594,25 +533,12 @@
                 <w:sz w:val="19"/>
                 <w:szCs w:val="19"/>
               </w:rPr>
-              <w:t>Confirmed to vary correctly by idea, not a fixed v</w:t>
-            </w:r>
-            <w:r>
-              <w:rPr>
-                <w:sz w:val="19"/>
-                <w:szCs w:val="19"/>
-              </w:rPr>
-              <w:t>alue</w:t>
+              <w:t>Confirmed to vary correctly by idea, not a fixed value</w:t>
             </w:r>
           </w:p>
         </w:tc>
       </w:tr>
       <w:tr>
-        <w:tblPrEx>
-          <w:tblCellMar>
-            <w:top w:w="0" w:type="dxa"/>
-            <w:bottom w:w="0" w:type="dxa"/>
-          </w:tblCellMar>
-        </w:tblPrEx>
         <w:tc>
           <w:tcPr>
             <w:tcW w:w="4200" w:type="dxa"/>
@@ -665,12 +591,6 @@
         </w:tc>
       </w:tr>
       <w:tr>
-        <w:tblPrEx>
-          <w:tblCellMar>
-            <w:top w:w="0" w:type="dxa"/>
-            <w:bottom w:w="0" w:type="dxa"/>
-          </w:tblCellMar>
-        </w:tblPrEx>
         <w:tc>
           <w:tcPr>
             <w:tcW w:w="4200" w:type="dxa"/>
@@ -723,12 +643,6 @@
         </w:tc>
       </w:tr>
       <w:tr>
-        <w:tblPrEx>
-          <w:tblCellMar>
-            <w:top w:w="0" w:type="dxa"/>
-            <w:bottom w:w="0" w:type="dxa"/>
-          </w:tblCellMar>
-        </w:tblPrEx>
         <w:tc>
           <w:tcPr>
             <w:tcW w:w="4200" w:type="dxa"/>
@@ -781,12 +695,6 @@
         </w:tc>
       </w:tr>
       <w:tr>
-        <w:tblPrEx>
-          <w:tblCellMar>
-            <w:top w:w="0" w:type="dxa"/>
-            <w:bottom w:w="0" w:type="dxa"/>
-          </w:tblCellMar>
-        </w:tblPrEx>
         <w:tc>
           <w:tcPr>
             <w:tcW w:w="4200" w:type="dxa"/>
@@ -819,25 +727,12 @@
                 <w:sz w:val="19"/>
                 <w:szCs w:val="19"/>
               </w:rPr>
-              <w:t>Confirmed to survive a full backend</w:t>
-            </w:r>
-            <w:r>
-              <w:rPr>
-                <w:sz w:val="19"/>
-                <w:szCs w:val="19"/>
-              </w:rPr>
-              <w:t xml:space="preserve"> restart</w:t>
+              <w:t>Confirmed to survive a full backend restart</w:t>
             </w:r>
           </w:p>
         </w:tc>
       </w:tr>
       <w:tr>
-        <w:tblPrEx>
-          <w:tblCellMar>
-            <w:top w:w="0" w:type="dxa"/>
-            <w:bottom w:w="0" w:type="dxa"/>
-          </w:tblCellMar>
-        </w:tblPrEx>
         <w:tc>
           <w:tcPr>
             <w:tcW w:w="4200" w:type="dxa"/>
@@ -876,12 +771,6 @@
         </w:tc>
       </w:tr>
       <w:tr>
-        <w:tblPrEx>
-          <w:tblCellMar>
-            <w:top w:w="0" w:type="dxa"/>
-            <w:bottom w:w="0" w:type="dxa"/>
-          </w:tblCellMar>
-        </w:tblPrEx>
         <w:tc>
           <w:tcPr>
             <w:tcW w:w="4200" w:type="dxa"/>
@@ -896,7 +785,7 @@
                 <w:sz w:val="19"/>
                 <w:szCs w:val="19"/>
               </w:rPr>
-              <w:t xml:space="preserve">Financial projections engine</w:t>
+              <w:t>Financial projections engine</w:t>
             </w:r>
           </w:p>
         </w:tc>
@@ -914,18 +803,12 @@
                 <w:sz w:val="19"/>
                 <w:szCs w:val="19"/>
               </w:rPr>
-              <w:t xml:space="preserve">Confirmed to produce idea-specific projections that vary by idea, matching each idea to a sector archetype and adjusting it by demand score, market size, and revenue model</w:t>
+              <w:t>Confirmed to produce idea-specific projections that vary by idea, matching each idea to a sector archetype and adjusting it by demand score, market size, and revenue model</w:t>
             </w:r>
           </w:p>
         </w:tc>
       </w:tr>
       <w:tr>
-        <w:tblPrEx>
-          <w:tblCellMar>
-            <w:top w:w="0" w:type="dxa"/>
-            <w:bottom w:w="0" w:type="dxa"/>
-          </w:tblCellMar>
-        </w:tblPrEx>
         <w:tc>
           <w:tcPr>
             <w:tcW w:w="4200" w:type="dxa"/>
@@ -940,7 +823,7 @@
                 <w:sz w:val="19"/>
                 <w:szCs w:val="19"/>
               </w:rPr>
-              <w:t xml:space="preserve">Risk assessment (Risks tab)</w:t>
+              <w:t>Risk assessment (Risks tab)</w:t>
             </w:r>
           </w:p>
         </w:tc>
@@ -958,7 +841,7 @@
                 <w:sz w:val="19"/>
                 <w:szCs w:val="19"/>
               </w:rPr>
-              <w:t xml:space="preserve">Confirmed to generate real high and medium priority risks with likelihood, impact, and mitigation, placed correctly on a likelihood-impact heat map</w:t>
+              <w:t>Confirmed to generate real high and medium priority risks with likelihood, impact, and mitigation, placed correctly on a likelihood-impact heat map</w:t>
             </w:r>
           </w:p>
         </w:tc>
@@ -973,11 +856,6 @@
       <w:pPr>
         <w:pStyle w:val="Heading1"/>
         <w:spacing w:before="200" w:after="100"/>
-        <w:rPr>
-          <w:color w:val="000000" w:themeColor="text1"/>
-        </w:rPr>
-      </w:pPr>
-      <w:r>
         <w:rPr>
           <w:b/>
           <w:bCs/>
@@ -985,242 +863,12 @@
           <w:sz w:val="25"/>
           <w:szCs w:val="25"/>
         </w:rPr>
-        <w:t>5. Market Positioning</w:t>
-      </w:r>
-    </w:p>
-    <w:p>
-      <w:pPr>
-        <w:spacing w:after="140" w:line="264" w:lineRule="auto"/>
-      </w:pPr>
-      <w:r>
-        <w:rPr>
-          <w:sz w:val="21"/>
-          <w:szCs w:val="21"/>
-        </w:rPr>
-        <w:t>Global tools already exist for AI startup idea validation, for example</w:t>
-      </w:r>
-      <w:r>
-        <w:rPr>
-          <w:sz w:val="21"/>
-          <w:szCs w:val="21"/>
-        </w:rPr>
-        <w:t>,</w:t>
-      </w:r>
-      <w:r>
-        <w:rPr>
-          <w:sz w:val="21"/>
-          <w:szCs w:val="21"/>
-        </w:rPr>
-        <w:t xml:space="preserve"> </w:t>
-      </w:r>
-      <w:proofErr w:type="spellStart"/>
-      <w:r>
-        <w:rPr>
-          <w:sz w:val="21"/>
-          <w:szCs w:val="21"/>
-        </w:rPr>
-        <w:t>ValidatorAI</w:t>
-      </w:r>
-      <w:proofErr w:type="spellEnd"/>
-      <w:r>
-        <w:rPr>
-          <w:sz w:val="21"/>
-          <w:szCs w:val="21"/>
-        </w:rPr>
-        <w:t xml:space="preserve">, </w:t>
-      </w:r>
-      <w:proofErr w:type="spellStart"/>
-      <w:r>
-        <w:rPr>
-          <w:sz w:val="21"/>
-          <w:szCs w:val="21"/>
-        </w:rPr>
-        <w:t>DimeADozen</w:t>
-      </w:r>
-      <w:proofErr w:type="spellEnd"/>
-      <w:r>
-        <w:rPr>
-          <w:sz w:val="21"/>
-          <w:szCs w:val="21"/>
-        </w:rPr>
-        <w:t xml:space="preserve">, and </w:t>
-      </w:r>
-      <w:proofErr w:type="spellStart"/>
-      <w:r>
-        <w:rPr>
-          <w:sz w:val="21"/>
-          <w:szCs w:val="21"/>
-        </w:rPr>
-        <w:t>Preuve</w:t>
-      </w:r>
-      <w:proofErr w:type="spellEnd"/>
-      <w:r>
-        <w:rPr>
-          <w:sz w:val="21"/>
-          <w:szCs w:val="21"/>
-        </w:rPr>
-        <w:t xml:space="preserve"> AI, and for AI investor pitch practice, for example</w:t>
-      </w:r>
-      <w:r>
-        <w:rPr>
-          <w:sz w:val="21"/>
-          <w:szCs w:val="21"/>
-        </w:rPr>
-        <w:t>,</w:t>
-      </w:r>
-      <w:r>
-        <w:rPr>
-          <w:sz w:val="21"/>
-          <w:szCs w:val="21"/>
-        </w:rPr>
-        <w:t xml:space="preserve"> </w:t>
-      </w:r>
-      <w:proofErr w:type="spellStart"/>
-      <w:r>
-        <w:rPr>
-          <w:sz w:val="21"/>
-          <w:szCs w:val="21"/>
-        </w:rPr>
-        <w:t>Kydarin</w:t>
-      </w:r>
-      <w:proofErr w:type="spellEnd"/>
-      <w:r>
-        <w:rPr>
-          <w:sz w:val="21"/>
-          <w:szCs w:val="21"/>
-        </w:rPr>
-        <w:t xml:space="preserve">, </w:t>
-      </w:r>
-      <w:proofErr w:type="spellStart"/>
-      <w:r>
-        <w:rPr>
-          <w:sz w:val="21"/>
-          <w:szCs w:val="21"/>
-        </w:rPr>
-        <w:t>PitchBob</w:t>
-      </w:r>
-      <w:proofErr w:type="spellEnd"/>
-      <w:r>
-        <w:rPr>
-          <w:sz w:val="21"/>
-          <w:szCs w:val="21"/>
-        </w:rPr>
-        <w:t xml:space="preserve">, and </w:t>
-      </w:r>
-      <w:proofErr w:type="spellStart"/>
-      <w:r>
-        <w:rPr>
-          <w:sz w:val="21"/>
-          <w:szCs w:val="21"/>
-        </w:rPr>
-        <w:t>AIPitchPractice</w:t>
-      </w:r>
-      <w:proofErr w:type="spellEnd"/>
-      <w:r>
-        <w:rPr>
-          <w:sz w:val="21"/>
-          <w:szCs w:val="21"/>
-        </w:rPr>
-        <w:t xml:space="preserve">. Presenting </w:t>
-      </w:r>
-      <w:proofErr w:type="spellStart"/>
-      <w:r>
-        <w:rPr>
-          <w:sz w:val="21"/>
-          <w:szCs w:val="21"/>
-        </w:rPr>
-        <w:t>FounderCheck</w:t>
-      </w:r>
-      <w:proofErr w:type="spellEnd"/>
-      <w:r>
-        <w:rPr>
-          <w:sz w:val="21"/>
-          <w:szCs w:val="21"/>
-        </w:rPr>
-        <w:t xml:space="preserve"> AI as inventing either category w</w:t>
-      </w:r>
-      <w:r>
-        <w:rPr>
-          <w:sz w:val="21"/>
-          <w:szCs w:val="21"/>
-        </w:rPr>
-        <w:t xml:space="preserve">ould not be accurate. The genuine opportunity is narrower: none of the tools identified in this research offer </w:t>
-      </w:r>
-      <w:r>
-        <w:rPr>
-          <w:sz w:val="21"/>
-          <w:szCs w:val="21"/>
-        </w:rPr>
-        <w:t>Bangladesh-specific</w:t>
-      </w:r>
-      <w:r>
-        <w:rPr>
-          <w:sz w:val="21"/>
-          <w:szCs w:val="21"/>
-        </w:rPr>
-        <w:t xml:space="preserve"> regulatory framing, Bangladesh </w:t>
-      </w:r>
-      <w:r>
-        <w:rPr>
-          <w:sz w:val="21"/>
-          <w:szCs w:val="21"/>
-        </w:rPr>
-        <w:t>Taka-denominated</w:t>
-      </w:r>
-      <w:r>
-        <w:rPr>
-          <w:sz w:val="21"/>
-          <w:szCs w:val="21"/>
-        </w:rPr>
-        <w:t xml:space="preserve"> figures, or Bangla language accessibility, and all are priced for a global, U</w:t>
-      </w:r>
-      <w:r>
-        <w:rPr>
-          <w:sz w:val="21"/>
-          <w:szCs w:val="21"/>
-        </w:rPr>
-        <w:t xml:space="preserve">nited States </w:t>
-      </w:r>
-      <w:r>
-        <w:rPr>
-          <w:sz w:val="21"/>
-          <w:szCs w:val="21"/>
-        </w:rPr>
-        <w:t>dollar-paying</w:t>
-      </w:r>
-      <w:r>
-        <w:rPr>
-          <w:sz w:val="21"/>
-          <w:szCs w:val="21"/>
-        </w:rPr>
-        <w:t xml:space="preserve"> audience. </w:t>
-      </w:r>
-      <w:proofErr w:type="spellStart"/>
-      <w:r>
-        <w:rPr>
-          <w:sz w:val="21"/>
-          <w:szCs w:val="21"/>
-        </w:rPr>
-        <w:t>FounderCheck</w:t>
-      </w:r>
-      <w:proofErr w:type="spellEnd"/>
-      <w:r>
-        <w:rPr>
-          <w:sz w:val="21"/>
-          <w:szCs w:val="21"/>
-        </w:rPr>
-        <w:t xml:space="preserve"> AI is positioned to serve a founder outside Bangladesh's concentrated mentor network, in one integrated flow rather than a set of separate foreign paid tools.</w:t>
-      </w:r>
+      </w:pPr>
     </w:p>
     <w:p>
       <w:pPr>
         <w:pStyle w:val="Heading1"/>
         <w:spacing w:before="200" w:after="100"/>
-        <w:rPr>
-          <w:color w:val="000000" w:themeColor="text1"/>
-        </w:rPr>
-      </w:pPr>
-      <w:r>
         <w:rPr>
           <w:b/>
           <w:bCs/>
@@ -1228,7 +876,256 @@
           <w:sz w:val="25"/>
           <w:szCs w:val="25"/>
         </w:rPr>
+      </w:pPr>
+    </w:p>
+    <w:p>
+      <w:pPr>
+        <w:pStyle w:val="Heading1"/>
+        <w:spacing w:before="200" w:after="100"/>
+        <w:rPr>
+          <w:color w:val="000000" w:themeColor="text1"/>
+        </w:rPr>
+      </w:pPr>
+      <w:bookmarkStart w:id="0" w:name="_GoBack"/>
+      <w:bookmarkEnd w:id="0"/>
+      <w:r>
+        <w:rPr>
+          <w:b/>
+          <w:bCs/>
+          <w:color w:val="000000" w:themeColor="text1"/>
+          <w:sz w:val="25"/>
+          <w:szCs w:val="25"/>
+        </w:rPr>
         <w:lastRenderedPageBreak/>
+        <w:t>5. Market Positioning</w:t>
+      </w:r>
+    </w:p>
+    <w:p>
+      <w:pPr>
+        <w:spacing w:after="140" w:line="264" w:lineRule="auto"/>
+      </w:pPr>
+      <w:r>
+        <w:rPr>
+          <w:sz w:val="21"/>
+          <w:szCs w:val="21"/>
+        </w:rPr>
+        <w:t>Global tools already exist for AI startup idea validation, for example</w:t>
+      </w:r>
+      <w:r>
+        <w:rPr>
+          <w:sz w:val="21"/>
+          <w:szCs w:val="21"/>
+        </w:rPr>
+        <w:t>,</w:t>
+      </w:r>
+      <w:r>
+        <w:rPr>
+          <w:sz w:val="21"/>
+          <w:szCs w:val="21"/>
+        </w:rPr>
+        <w:t xml:space="preserve"> </w:t>
+      </w:r>
+      <w:proofErr w:type="spellStart"/>
+      <w:r>
+        <w:rPr>
+          <w:sz w:val="21"/>
+          <w:szCs w:val="21"/>
+        </w:rPr>
+        <w:t>ValidatorAI</w:t>
+      </w:r>
+      <w:proofErr w:type="spellEnd"/>
+      <w:r>
+        <w:rPr>
+          <w:sz w:val="21"/>
+          <w:szCs w:val="21"/>
+        </w:rPr>
+        <w:t xml:space="preserve">, </w:t>
+      </w:r>
+      <w:proofErr w:type="spellStart"/>
+      <w:r>
+        <w:rPr>
+          <w:sz w:val="21"/>
+          <w:szCs w:val="21"/>
+        </w:rPr>
+        <w:t>DimeADozen</w:t>
+      </w:r>
+      <w:proofErr w:type="spellEnd"/>
+      <w:r>
+        <w:rPr>
+          <w:sz w:val="21"/>
+          <w:szCs w:val="21"/>
+        </w:rPr>
+        <w:t xml:space="preserve">, and </w:t>
+      </w:r>
+      <w:proofErr w:type="spellStart"/>
+      <w:r>
+        <w:rPr>
+          <w:sz w:val="21"/>
+          <w:szCs w:val="21"/>
+        </w:rPr>
+        <w:t>Preuve</w:t>
+      </w:r>
+      <w:proofErr w:type="spellEnd"/>
+      <w:r>
+        <w:rPr>
+          <w:sz w:val="21"/>
+          <w:szCs w:val="21"/>
+        </w:rPr>
+        <w:t xml:space="preserve"> AI, and for AI investor pitch practice, for example</w:t>
+      </w:r>
+      <w:r>
+        <w:rPr>
+          <w:sz w:val="21"/>
+          <w:szCs w:val="21"/>
+        </w:rPr>
+        <w:t>,</w:t>
+      </w:r>
+      <w:r>
+        <w:rPr>
+          <w:sz w:val="21"/>
+          <w:szCs w:val="21"/>
+        </w:rPr>
+        <w:t xml:space="preserve"> </w:t>
+      </w:r>
+      <w:proofErr w:type="spellStart"/>
+      <w:r>
+        <w:rPr>
+          <w:sz w:val="21"/>
+          <w:szCs w:val="21"/>
+        </w:rPr>
+        <w:t>Kydarin</w:t>
+      </w:r>
+      <w:proofErr w:type="spellEnd"/>
+      <w:r>
+        <w:rPr>
+          <w:sz w:val="21"/>
+          <w:szCs w:val="21"/>
+        </w:rPr>
+        <w:t xml:space="preserve">, </w:t>
+      </w:r>
+      <w:proofErr w:type="spellStart"/>
+      <w:r>
+        <w:rPr>
+          <w:sz w:val="21"/>
+          <w:szCs w:val="21"/>
+        </w:rPr>
+        <w:t>PitchBob</w:t>
+      </w:r>
+      <w:proofErr w:type="spellEnd"/>
+      <w:r>
+        <w:rPr>
+          <w:sz w:val="21"/>
+          <w:szCs w:val="21"/>
+        </w:rPr>
+        <w:t xml:space="preserve">, and </w:t>
+      </w:r>
+      <w:proofErr w:type="spellStart"/>
+      <w:r>
+        <w:rPr>
+          <w:sz w:val="21"/>
+          <w:szCs w:val="21"/>
+        </w:rPr>
+        <w:t>AIPitchPractice</w:t>
+      </w:r>
+      <w:proofErr w:type="spellEnd"/>
+      <w:r>
+        <w:rPr>
+          <w:sz w:val="21"/>
+          <w:szCs w:val="21"/>
+        </w:rPr>
+        <w:t xml:space="preserve">. Presenting </w:t>
+      </w:r>
+      <w:proofErr w:type="spellStart"/>
+      <w:r>
+        <w:rPr>
+          <w:sz w:val="21"/>
+          <w:szCs w:val="21"/>
+        </w:rPr>
+        <w:t>FounderCheck</w:t>
+      </w:r>
+      <w:proofErr w:type="spellEnd"/>
+      <w:r>
+        <w:rPr>
+          <w:sz w:val="21"/>
+          <w:szCs w:val="21"/>
+        </w:rPr>
+        <w:t xml:space="preserve"> AI as inventing either category would not be accurate. The genuine opportunity is narrower: none of the tools identified in this research offer </w:t>
+      </w:r>
+      <w:r>
+        <w:rPr>
+          <w:sz w:val="21"/>
+          <w:szCs w:val="21"/>
+        </w:rPr>
+        <w:t>Bangladesh-specific</w:t>
+      </w:r>
+      <w:r>
+        <w:rPr>
+          <w:sz w:val="21"/>
+          <w:szCs w:val="21"/>
+        </w:rPr>
+        <w:t xml:space="preserve"> regulatory framing, Bangladesh </w:t>
+      </w:r>
+      <w:r>
+        <w:rPr>
+          <w:sz w:val="21"/>
+          <w:szCs w:val="21"/>
+        </w:rPr>
+        <w:t>Taka-denominated</w:t>
+      </w:r>
+      <w:r>
+        <w:rPr>
+          <w:sz w:val="21"/>
+          <w:szCs w:val="21"/>
+        </w:rPr>
+        <w:t xml:space="preserve"> figures, or Bangla language accessibility, and all are priced for a global, United States </w:t>
+      </w:r>
+      <w:r>
+        <w:rPr>
+          <w:sz w:val="21"/>
+          <w:szCs w:val="21"/>
+        </w:rPr>
+        <w:t>dollar-paying</w:t>
+      </w:r>
+      <w:r>
+        <w:rPr>
+          <w:sz w:val="21"/>
+          <w:szCs w:val="21"/>
+        </w:rPr>
+        <w:t xml:space="preserve"> audience. </w:t>
+      </w:r>
+      <w:proofErr w:type="spellStart"/>
+      <w:r>
+        <w:rPr>
+          <w:sz w:val="21"/>
+          <w:szCs w:val="21"/>
+        </w:rPr>
+        <w:t>FounderCheck</w:t>
+      </w:r>
+      <w:proofErr w:type="spellEnd"/>
+      <w:r>
+        <w:rPr>
+          <w:sz w:val="21"/>
+          <w:szCs w:val="21"/>
+        </w:rPr>
+        <w:t xml:space="preserve"> AI is positioned to serve a founder outside Bangladesh's concentrated mentor network, in one integrated flow rather than a set of separate foreign paid tools.</w:t>
+      </w:r>
+    </w:p>
+    <w:p>
+      <w:pPr>
+        <w:pStyle w:val="Heading1"/>
+        <w:spacing w:before="200" w:after="100"/>
+        <w:rPr>
+          <w:color w:val="000000" w:themeColor="text1"/>
+        </w:rPr>
+      </w:pPr>
+      <w:r>
+        <w:rPr>
+          <w:b/>
+          <w:bCs/>
+          <w:color w:val="000000" w:themeColor="text1"/>
+          <w:sz w:val="25"/>
+          <w:szCs w:val="25"/>
+        </w:rPr>
         <w:t>6. Known Limitations</w:t>
       </w:r>
     </w:p>
@@ -1241,7 +1138,21 @@
           <w:sz w:val="21"/>
           <w:szCs w:val="21"/>
         </w:rPr>
-        <w:t xml:space="preserve">Two limitations previously disclosed here have since been resolved. The financial projection engine, which once used generic assumptions, now produces idea-specific projections by matching each idea to a sector archetype and adjusting it by demand score, market size, and revenue model. The risk assessment module, whose function existed but was not called, is now wired into the extended analysis pipeline and rendered in the Risks tab as high and medium priority risks with likelihood, impact, and mitigation.</w:t>
+        <w:t xml:space="preserve">Two limitations previously disclosed here have since been resolved. The financial projection engine, which once used generic assumptions, now produces idea-specific projections by matching each idea to a sector archetype and adjusting it by demand score, market size, and revenue model. The risk assessment module, whose function existed but was not called, is now wired into the extended analysis pipeline and rendered in the Risks tab as high and </w:t>
+      </w:r>
+      <w:r>
+        <w:rPr>
+          <w:sz w:val="21"/>
+          <w:szCs w:val="21"/>
+        </w:rPr>
+        <w:t>medium-priority</w:t>
+      </w:r>
+      <w:r>
+        <w:rPr>
+          <w:sz w:val="21"/>
+          <w:szCs w:val="21"/>
+        </w:rPr>
+        <w:t xml:space="preserve"> risks with likelihood, impact, and mitigation.</w:t>
       </w:r>
     </w:p>
     <w:p>
@@ -1253,14 +1164,7 @@
           <w:sz w:val="21"/>
           <w:szCs w:val="21"/>
         </w:rPr>
-        <w:t>A remaining, more structural limitation is that analysis is currently generated from a language model's internal knowledge rather than pulled from live, citable sources, so competitor names and market figures shown to a user are plausible estimates, not veri</w:t>
-      </w:r>
-      <w:r>
-        <w:rPr>
-          <w:sz w:val="21"/>
-          <w:szCs w:val="21"/>
-        </w:rPr>
-        <w:t>fied facts.</w:t>
+        <w:t>A remaining, more structural limitation is that analysis is currently generated from a language model's internal knowledge rather than pulled from live, citable sources, so competitor names and market figures shown to a user are plausible estimates, not verified facts.</w:t>
       </w:r>
     </w:p>
     <w:p>
@@ -1368,8 +1272,6 @@
         </w:rPr>
         <w:t>Pranto</w:t>
       </w:r>
-      <w:bookmarkStart w:id="0" w:name="_GoBack"/>
-      <w:bookmarkEnd w:id="0"/>
       <w:proofErr w:type="spellEnd"/>
     </w:p>
     <w:p>
@@ -1384,7 +1286,7 @@
           <w:szCs w:val="21"/>
         </w:rPr>
         <w:tab/>
-        <w:t>ID: 0242310005341473</w:t>
+        <w:t>ID: 024231000534</w:t>
       </w:r>
     </w:p>
     <w:p>

</xml_diff>